<commit_message>
Feature/Refactor: Outbox pattern implemented, class, controller etc. The outbox is integrated into bookingcontroller and registrered to DI. Documentation updated
</commit_message>
<xml_diff>
--- a/docs/school_related/teknisk_dokumentation_clo24nikhal.docx
+++ b/docs/school_related/teknisk_dokumentation_clo24nikhal.docx
@@ -1540,27 +1540,7 @@
           <w:szCs w:val="24"/>
           <w:lang w:val="sv-SE"/>
         </w:rPr>
-        <w:t xml:space="preserve">xtensiv dokumentation återfinns i foldern </w:t>
-      </w:r>
-      <w:proofErr w:type="spellStart"/>
-      <w:r>
-        <w:rPr>
-          <w:rFonts w:ascii="Calibri" w:hAnsi="Calibri" w:cs="Calibri"/>
-          <w:sz w:val="24"/>
-          <w:szCs w:val="24"/>
-          <w:lang w:val="sv-SE"/>
-        </w:rPr>
-        <w:t>docs</w:t>
-      </w:r>
-      <w:proofErr w:type="spellEnd"/>
-      <w:r>
-        <w:rPr>
-          <w:rFonts w:ascii="Calibri" w:hAnsi="Calibri" w:cs="Calibri"/>
-          <w:sz w:val="24"/>
-          <w:szCs w:val="24"/>
-          <w:lang w:val="sv-SE"/>
-        </w:rPr>
-        <w:t>.</w:t>
+        <w:t>xtensiv dokumentation återfinns i foldern docs.</w:t>
       </w:r>
       <w:r>
         <w:rPr>
@@ -1606,6 +1586,7 @@
       <w:r>
         <w:rPr>
           <w:rFonts w:ascii="Calibri" w:hAnsi="Calibri" w:cs="Calibri"/>
+          <w:noProof/>
           <w:sz w:val="24"/>
           <w:szCs w:val="24"/>
           <w:lang w:val="sv-SE"/>
@@ -1753,16 +1734,16 @@
           <w:lang w:val="sv-SE"/>
         </w:rPr>
       </w:pPr>
-      <w:bookmarkStart w:id="3" w:name="_Toc215042705"/>
-      <w:bookmarkStart w:id="4" w:name="_2._Arbetsmetodik"/>
+      <w:bookmarkStart w:id="3" w:name="_2._Arbetsmetodik"/>
+      <w:bookmarkStart w:id="4" w:name="_Toc215042705"/>
+      <w:bookmarkEnd w:id="3"/>
+      <w:r>
+        <w:rPr>
+          <w:lang w:val="sv-SE"/>
+        </w:rPr>
+        <w:t>2. Arbetsmetodik</w:t>
+      </w:r>
       <w:bookmarkEnd w:id="4"/>
-      <w:r>
-        <w:rPr>
-          <w:lang w:val="sv-SE"/>
-        </w:rPr>
-        <w:t>2. Arbetsmetodik</w:t>
-      </w:r>
-      <w:bookmarkEnd w:id="3"/>
     </w:p>
     <w:p>
       <w:pPr>
@@ -1868,37 +1849,15 @@
           <w:lang w:val="sv-SE"/>
         </w:rPr>
       </w:pPr>
-      <w:proofErr w:type="spellStart"/>
-      <w:r>
-        <w:rPr>
-          <w:rFonts w:ascii="Calibri" w:hAnsi="Calibri" w:cs="Calibri"/>
-          <w:sz w:val="24"/>
-          <w:szCs w:val="24"/>
-          <w:lang w:val="sv-SE"/>
-        </w:rPr>
-        <w:t>Lorum</w:t>
-      </w:r>
-      <w:proofErr w:type="spellEnd"/>
-      <w:r>
-        <w:rPr>
-          <w:rFonts w:ascii="Calibri" w:hAnsi="Calibri" w:cs="Calibri"/>
-          <w:sz w:val="24"/>
-          <w:szCs w:val="24"/>
-          <w:lang w:val="sv-SE"/>
-        </w:rPr>
-        <w:t xml:space="preserve"> </w:t>
-      </w:r>
-      <w:proofErr w:type="spellStart"/>
-      <w:r>
-        <w:rPr>
-          <w:rFonts w:ascii="Calibri" w:hAnsi="Calibri" w:cs="Calibri"/>
-          <w:sz w:val="24"/>
-          <w:szCs w:val="24"/>
-          <w:lang w:val="sv-SE"/>
-        </w:rPr>
-        <w:t>Ipsum</w:t>
-      </w:r>
-      <w:proofErr w:type="spellEnd"/>
+      <w:r>
+        <w:rPr>
+          <w:rFonts w:ascii="Calibri" w:hAnsi="Calibri" w:cs="Calibri"/>
+          <w:sz w:val="24"/>
+          <w:szCs w:val="24"/>
+          <w:lang w:val="sv-SE"/>
+        </w:rPr>
+        <w:t>Lorum Ipsum</w:t>
+      </w:r>
     </w:p>
     <w:p>
       <w:pPr>
@@ -1932,37 +1891,15 @@
           <w:lang w:val="sv-SE"/>
         </w:rPr>
       </w:pPr>
-      <w:proofErr w:type="spellStart"/>
-      <w:r>
-        <w:rPr>
-          <w:rFonts w:ascii="Calibri" w:hAnsi="Calibri" w:cs="Calibri"/>
-          <w:sz w:val="24"/>
-          <w:szCs w:val="24"/>
-          <w:lang w:val="sv-SE"/>
-        </w:rPr>
-        <w:t>Lorum</w:t>
-      </w:r>
-      <w:proofErr w:type="spellEnd"/>
-      <w:r>
-        <w:rPr>
-          <w:rFonts w:ascii="Calibri" w:hAnsi="Calibri" w:cs="Calibri"/>
-          <w:sz w:val="24"/>
-          <w:szCs w:val="24"/>
-          <w:lang w:val="sv-SE"/>
-        </w:rPr>
-        <w:t xml:space="preserve"> </w:t>
-      </w:r>
-      <w:proofErr w:type="spellStart"/>
-      <w:r>
-        <w:rPr>
-          <w:rFonts w:ascii="Calibri" w:hAnsi="Calibri" w:cs="Calibri"/>
-          <w:sz w:val="24"/>
-          <w:szCs w:val="24"/>
-          <w:lang w:val="sv-SE"/>
-        </w:rPr>
-        <w:t>Ipsum</w:t>
-      </w:r>
-      <w:proofErr w:type="spellEnd"/>
+      <w:r>
+        <w:rPr>
+          <w:rFonts w:ascii="Calibri" w:hAnsi="Calibri" w:cs="Calibri"/>
+          <w:sz w:val="24"/>
+          <w:szCs w:val="24"/>
+          <w:lang w:val="sv-SE"/>
+        </w:rPr>
+        <w:t>Lorum Ipsum</w:t>
+      </w:r>
     </w:p>
     <w:p>
       <w:pPr>
@@ -1995,37 +1932,15 @@
           <w:lang w:val="sv-SE"/>
         </w:rPr>
       </w:pPr>
-      <w:proofErr w:type="spellStart"/>
-      <w:r>
-        <w:rPr>
-          <w:rFonts w:ascii="Calibri" w:hAnsi="Calibri" w:cs="Calibri"/>
-          <w:sz w:val="24"/>
-          <w:szCs w:val="24"/>
-          <w:lang w:val="sv-SE"/>
-        </w:rPr>
-        <w:t>Lorum</w:t>
-      </w:r>
-      <w:proofErr w:type="spellEnd"/>
-      <w:r>
-        <w:rPr>
-          <w:rFonts w:ascii="Calibri" w:hAnsi="Calibri" w:cs="Calibri"/>
-          <w:sz w:val="24"/>
-          <w:szCs w:val="24"/>
-          <w:lang w:val="sv-SE"/>
-        </w:rPr>
-        <w:t xml:space="preserve"> </w:t>
-      </w:r>
-      <w:proofErr w:type="spellStart"/>
-      <w:r>
-        <w:rPr>
-          <w:rFonts w:ascii="Calibri" w:hAnsi="Calibri" w:cs="Calibri"/>
-          <w:sz w:val="24"/>
-          <w:szCs w:val="24"/>
-          <w:lang w:val="sv-SE"/>
-        </w:rPr>
-        <w:t>Ipsum</w:t>
-      </w:r>
-      <w:proofErr w:type="spellEnd"/>
+      <w:r>
+        <w:rPr>
+          <w:rFonts w:ascii="Calibri" w:hAnsi="Calibri" w:cs="Calibri"/>
+          <w:sz w:val="24"/>
+          <w:szCs w:val="24"/>
+          <w:lang w:val="sv-SE"/>
+        </w:rPr>
+        <w:t>Lorum Ipsum</w:t>
+      </w:r>
     </w:p>
     <w:p>
       <w:pPr>
@@ -2175,37 +2090,15 @@
           <w:lang w:val="sv-SE"/>
         </w:rPr>
       </w:pPr>
-      <w:proofErr w:type="spellStart"/>
-      <w:r>
-        <w:rPr>
-          <w:rFonts w:ascii="Calibri" w:hAnsi="Calibri" w:cs="Calibri"/>
-          <w:sz w:val="24"/>
-          <w:szCs w:val="24"/>
-          <w:lang w:val="sv-SE"/>
-        </w:rPr>
-        <w:t>Lorum</w:t>
-      </w:r>
-      <w:proofErr w:type="spellEnd"/>
-      <w:r>
-        <w:rPr>
-          <w:rFonts w:ascii="Calibri" w:hAnsi="Calibri" w:cs="Calibri"/>
-          <w:sz w:val="24"/>
-          <w:szCs w:val="24"/>
-          <w:lang w:val="sv-SE"/>
-        </w:rPr>
-        <w:t xml:space="preserve"> </w:t>
-      </w:r>
-      <w:proofErr w:type="spellStart"/>
-      <w:r>
-        <w:rPr>
-          <w:rFonts w:ascii="Calibri" w:hAnsi="Calibri" w:cs="Calibri"/>
-          <w:sz w:val="24"/>
-          <w:szCs w:val="24"/>
-          <w:lang w:val="sv-SE"/>
-        </w:rPr>
-        <w:t>Ipsum</w:t>
-      </w:r>
-      <w:proofErr w:type="spellEnd"/>
+      <w:r>
+        <w:rPr>
+          <w:rFonts w:ascii="Calibri" w:hAnsi="Calibri" w:cs="Calibri"/>
+          <w:sz w:val="24"/>
+          <w:szCs w:val="24"/>
+          <w:lang w:val="sv-SE"/>
+        </w:rPr>
+        <w:t>Lorum Ipsum</w:t>
+      </w:r>
     </w:p>
     <w:p>
       <w:pPr>
@@ -2238,37 +2131,15 @@
           <w:lang w:val="sv-SE"/>
         </w:rPr>
       </w:pPr>
-      <w:proofErr w:type="spellStart"/>
-      <w:r>
-        <w:rPr>
-          <w:rFonts w:ascii="Calibri" w:hAnsi="Calibri" w:cs="Calibri"/>
-          <w:sz w:val="24"/>
-          <w:szCs w:val="24"/>
-          <w:lang w:val="sv-SE"/>
-        </w:rPr>
-        <w:t>Lorum</w:t>
-      </w:r>
-      <w:proofErr w:type="spellEnd"/>
-      <w:r>
-        <w:rPr>
-          <w:rFonts w:ascii="Calibri" w:hAnsi="Calibri" w:cs="Calibri"/>
-          <w:sz w:val="24"/>
-          <w:szCs w:val="24"/>
-          <w:lang w:val="sv-SE"/>
-        </w:rPr>
-        <w:t xml:space="preserve"> </w:t>
-      </w:r>
-      <w:proofErr w:type="spellStart"/>
-      <w:r>
-        <w:rPr>
-          <w:rFonts w:ascii="Calibri" w:hAnsi="Calibri" w:cs="Calibri"/>
-          <w:sz w:val="24"/>
-          <w:szCs w:val="24"/>
-          <w:lang w:val="sv-SE"/>
-        </w:rPr>
-        <w:t>Ipsum</w:t>
-      </w:r>
-      <w:proofErr w:type="spellEnd"/>
+      <w:r>
+        <w:rPr>
+          <w:rFonts w:ascii="Calibri" w:hAnsi="Calibri" w:cs="Calibri"/>
+          <w:sz w:val="24"/>
+          <w:szCs w:val="24"/>
+          <w:lang w:val="sv-SE"/>
+        </w:rPr>
+        <w:t>Lorum Ipsum</w:t>
+      </w:r>
     </w:p>
     <w:p>
       <w:pPr>
@@ -2321,47 +2192,7 @@
           <w:szCs w:val="24"/>
           <w:lang w:val="sv-SE"/>
         </w:rPr>
-        <w:t xml:space="preserve">Beskriv </w:t>
-      </w:r>
-      <w:proofErr w:type="spellStart"/>
-      <w:r>
-        <w:rPr>
-          <w:rFonts w:ascii="Calibri" w:hAnsi="Calibri" w:cs="Calibri"/>
-          <w:sz w:val="24"/>
-          <w:szCs w:val="24"/>
-          <w:lang w:val="sv-SE"/>
-        </w:rPr>
-        <w:t>backend</w:t>
-      </w:r>
-      <w:proofErr w:type="spellEnd"/>
-      <w:r>
-        <w:rPr>
-          <w:rFonts w:ascii="Calibri" w:hAnsi="Calibri" w:cs="Calibri"/>
-          <w:sz w:val="24"/>
-          <w:szCs w:val="24"/>
-          <w:lang w:val="sv-SE"/>
-        </w:rPr>
-        <w:t xml:space="preserve">, </w:t>
-      </w:r>
-      <w:proofErr w:type="spellStart"/>
-      <w:r>
-        <w:rPr>
-          <w:rFonts w:ascii="Calibri" w:hAnsi="Calibri" w:cs="Calibri"/>
-          <w:sz w:val="24"/>
-          <w:szCs w:val="24"/>
-          <w:lang w:val="sv-SE"/>
-        </w:rPr>
-        <w:t>frontend</w:t>
-      </w:r>
-      <w:proofErr w:type="spellEnd"/>
-      <w:r>
-        <w:rPr>
-          <w:rFonts w:ascii="Calibri" w:hAnsi="Calibri" w:cs="Calibri"/>
-          <w:sz w:val="24"/>
-          <w:szCs w:val="24"/>
-          <w:lang w:val="sv-SE"/>
-        </w:rPr>
-        <w:t>, databas och interna moduler.</w:t>
+        <w:t>Beskriv backend, frontend, databas och interna moduler.</w:t>
       </w:r>
     </w:p>
     <w:p>
@@ -2415,27 +2246,7 @@
           <w:szCs w:val="24"/>
           <w:lang w:val="sv-SE"/>
         </w:rPr>
-        <w:t xml:space="preserve">Autentisering, dataflöden, externa </w:t>
-      </w:r>
-      <w:proofErr w:type="spellStart"/>
-      <w:r>
-        <w:rPr>
-          <w:rFonts w:ascii="Calibri" w:hAnsi="Calibri" w:cs="Calibri"/>
-          <w:sz w:val="24"/>
-          <w:szCs w:val="24"/>
-          <w:lang w:val="sv-SE"/>
-        </w:rPr>
-        <w:t>API:er</w:t>
-      </w:r>
-      <w:proofErr w:type="spellEnd"/>
-      <w:r>
-        <w:rPr>
-          <w:rFonts w:ascii="Calibri" w:hAnsi="Calibri" w:cs="Calibri"/>
-          <w:sz w:val="24"/>
-          <w:szCs w:val="24"/>
-          <w:lang w:val="sv-SE"/>
-        </w:rPr>
-        <w:t>.</w:t>
+        <w:t>Autentisering, dataflöden, externa API:er.</w:t>
       </w:r>
     </w:p>
     <w:p>
@@ -2528,7 +2339,6 @@
         </w:rPr>
         <w:t xml:space="preserve">. </w:t>
       </w:r>
-      <w:proofErr w:type="spellStart"/>
       <w:r>
         <w:rPr>
           <w:lang w:val="sv-SE"/>
@@ -2536,7 +2346,6 @@
         <w:t>Deployment</w:t>
       </w:r>
       <w:bookmarkEnd w:id="16"/>
-      <w:proofErr w:type="spellEnd"/>
     </w:p>
     <w:p>
       <w:pPr>
@@ -2595,7 +2404,6 @@
           <w:lang w:val="sv-SE"/>
         </w:rPr>
       </w:pPr>
-      <w:proofErr w:type="spellStart"/>
       <w:r>
         <w:rPr>
           <w:rFonts w:ascii="Calibri" w:hAnsi="Calibri" w:cs="Calibri"/>
@@ -2605,7 +2413,6 @@
         </w:rPr>
         <w:t>Meow</w:t>
       </w:r>
-      <w:proofErr w:type="spellEnd"/>
     </w:p>
     <w:sectPr>
       <w:pgSz w:w="11906" w:h="16838"/>
@@ -3222,6 +3029,7 @@
   <w:style w:type="character" w:default="1" w:styleId="DefaultParagraphFont">
     <w:name w:val="Default Paragraph Font"/>
     <w:uiPriority w:val="1"/>
+    <w:semiHidden/>
     <w:unhideWhenUsed/>
   </w:style>
   <w:style w:type="table" w:default="1" w:styleId="TableNormal">

</xml_diff>